<commit_message>
Complete Final Project with deployment
</commit_message>
<xml_diff>
--- a/Links.docx
+++ b/Links.docx
@@ -3,27 +3,17 @@
 <w:document xmlns:wpc="http://schemas.microsoft.com/office/word/2010/wordprocessingCanvas" xmlns:cx="http://schemas.microsoft.com/office/drawing/2014/chartex" xmlns:cx1="http://schemas.microsoft.com/office/drawing/2015/9/8/chartex" xmlns:cx2="http://schemas.microsoft.com/office/drawing/2015/10/21/chartex" xmlns:cx3="http://schemas.microsoft.com/office/drawing/2016/5/9/chartex" xmlns:cx4="http://schemas.microsoft.com/office/drawing/2016/5/10/chartex" xmlns:cx5="http://schemas.microsoft.com/office/drawing/2016/5/11/chartex" xmlns:cx6="http://schemas.microsoft.com/office/drawing/2016/5/12/chartex" xmlns:cx7="http://schemas.microsoft.com/office/drawing/2016/5/13/chartex" xmlns:cx8="http://schemas.microsoft.com/office/drawing/2016/5/14/chartex" xmlns:mc="http://schemas.openxmlformats.org/markup-compatibility/2006" xmlns:aink="http://schemas.microsoft.com/office/drawing/2016/ink" xmlns:am3d="http://schemas.microsoft.com/office/drawing/2017/model3d" xmlns:o="urn:schemas-microsoft-com:office:office" xmlns:oel="http://schemas.microsoft.com/office/2019/extlst" xmlns:r="http://schemas.openxmlformats.org/officeDocument/2006/relationships" xmlns:m="http://schemas.openxmlformats.org/officeDocument/2006/math" xmlns:v="urn:schemas-microsoft-com:vml" xmlns:wp14="http://schemas.microsoft.com/office/word/2010/wordprocessingDrawing" xmlns:wp="http://schemas.openxmlformats.org/drawingml/2006/wordprocessingDrawing" xmlns:w10="urn:schemas-microsoft-com:office:word" xmlns:w="http://schemas.openxmlformats.org/wordprocessingml/2006/main" xmlns:w14="http://schemas.microsoft.com/office/word/2010/wordml" xmlns:w15="http://schemas.microsoft.com/office/word/2012/wordml" xmlns:w16cex="http://schemas.microsoft.com/office/word/2018/wordml/cex" xmlns:w16cid="http://schemas.microsoft.com/office/word/2016/wordml/cid" xmlns:w16="http://schemas.microsoft.com/office/word/2018/wordml" xmlns:w16du="http://schemas.microsoft.com/office/word/2023/wordml/word16du" xmlns:w16sdtdh="http://schemas.microsoft.com/office/word/2020/wordml/sdtdatahash" xmlns:w16sdtfl="http://schemas.microsoft.com/office/word/2024/wordml/sdtformatlock" xmlns:w16se="http://schemas.microsoft.com/office/word/2015/wordml/symex" xmlns:wpg="http://schemas.microsoft.com/office/word/2010/wordprocessingGroup" xmlns:wpi="http://schemas.microsoft.com/office/word/2010/wordprocessingInk" xmlns:wne="http://schemas.microsoft.com/office/word/2006/wordml" xmlns:wps="http://schemas.microsoft.com/office/word/2010/wordprocessingShape" mc:Ignorable="w14 w15 w16se w16cid w16 w16cex w16sdtdh w16sdtfl w16du wp14">
   <w:body>
     <w:p>
-      <w:r>
-        <w:fldChar w:fldCharType="begin"/>
-      </w:r>
-      <w:r>
-        <w:instrText>HYPERLINK "https://fast-recipes.vercel.app/" \t "_blank"</w:instrText>
-      </w:r>
-      <w:r>
-        <w:fldChar w:fldCharType="separate"/>
-      </w:r>
-      <w:r>
-        <w:rPr>
-          <w:rStyle w:val="Hyperlink"/>
-        </w:rPr>
-        <w:t>fast-recipes.vercel.app</w:t>
-      </w:r>
-      <w:r>
-        <w:fldChar w:fldCharType="end"/>
-      </w:r>
+      <w:hyperlink r:id="rId4" w:history="1">
+        <w:r>
+          <w:rPr>
+            <w:rStyle w:val="Hyperlink"/>
+          </w:rPr>
+          <w:t>https://fastrecipes.vercel.app/</w:t>
+        </w:r>
+      </w:hyperlink>
     </w:p>
     <w:p>
-      <w:hyperlink r:id="rId4" w:history="1">
+      <w:hyperlink r:id="rId5" w:history="1">
         <w:r>
           <w:rPr>
             <w:rStyle w:val="Hyperlink"/>
@@ -31,33 +21,6 @@
           <w:t>https://github.com/rodyudi12/Meal_Recipes.git</w:t>
         </w:r>
       </w:hyperlink>
-    </w:p>
-    <w:p>
-      <w:r>
-        <w:t xml:space="preserve">I don’t know why, but my deployment is not working. The local website </w:t>
-      </w:r>
-      <w:r>
-        <w:t xml:space="preserve">(when I run </w:t>
-      </w:r>
-      <w:proofErr w:type="spellStart"/>
-      <w:r>
-        <w:t>npm</w:t>
-      </w:r>
-      <w:proofErr w:type="spellEnd"/>
-      <w:r>
-        <w:t xml:space="preserve"> run dev) </w:t>
-      </w:r>
-      <w:r>
-        <w:t xml:space="preserve">is working but my </w:t>
-      </w:r>
-      <w:proofErr w:type="spellStart"/>
-      <w:r>
-        <w:t>Vercel</w:t>
-      </w:r>
-      <w:proofErr w:type="spellEnd"/>
-      <w:r>
-        <w:t xml:space="preserve"> is not. Do you know what that could be? Thank you</w:t>
-      </w:r>
     </w:p>
     <w:sectPr>
       <w:pgSz w:w="11906" w:h="16838"/>
@@ -672,6 +635,7 @@
   <w:style w:type="character" w:default="1" w:styleId="DefaultParagraphFont">
     <w:name w:val="Default Paragraph Font"/>
     <w:uiPriority w:val="1"/>
+    <w:semiHidden/>
     <w:unhideWhenUsed/>
   </w:style>
   <w:style w:type="table" w:default="1" w:styleId="TableNormal">

</xml_diff>